<commit_message>
Ekspor Word ulang: log mentah memuat entri slice 02
docs/word/log-mentah.docx dan arsip bukti revisi diregenerasi setelah log
mentah slice 02 ditambahkan.

🤖 Generated with Codebuff
Co-Authored-By: Codebuff <noreply@codebuff.com>
</commit_message>
<xml_diff>
--- a/docs/word-arsip/(ARSIP) catatan-demo.docx
+++ b/docs/word-arsip/(ARSIP) catatan-demo.docx
@@ -224,6 +224,117 @@
       </w:pPr>
       <w:r>
         <w:t>**Slice 10**: cache L1, mode gelap, Octane Swoole, demo dari link deploy VPS.</w:t>
+      </w:r>
+    </w:p>
+    <w:p>
+      <w:r/>
+    </w:p>
+    <w:p>
+      <w:r>
+        <w:t>────────────────────────────────────────</w:t>
+      </w:r>
+    </w:p>
+    <w:p>
+      <w:r/>
+    </w:p>
+    <w:p>
+      <w:pPr>
+        <w:pStyle w:val="Heading2"/>
+      </w:pPr>
+      <w:r>
+        <w:t>Demo Slice 02 — Sekolah, Kelas, Mapel, Murid, Impor/Ekspor CSV, Pengaturan Tiga Lapis</w:t>
+      </w:r>
+    </w:p>
+    <w:p>
+      <w:r/>
+    </w:p>
+    <w:p>
+      <w:r>
+        <w:t>Prasyarat: backend `php artisan serve` (port 8000) dan frontend `npm run dev` (port 5173) hidup; database sudah di-seed:</w:t>
+      </w:r>
+    </w:p>
+    <w:p>
+      <w:r/>
+    </w:p>
+    <w:p>
+      <w:r>
+        <w:t>cd backend &amp;&amp; php artisan migrate:fresh --seed</w:t>
+      </w:r>
+    </w:p>
+    <w:p>
+      <w:r/>
+    </w:p>
+    <w:p>
+      <w:r>
+        <w:t>Seeder membuat sekolah contoh, 3 kelas (6A/6B/5A), 3 mapel, dan akun admin `admin@sekolah.test` / `Passw0rd!Aman`.</w:t>
+      </w:r>
+    </w:p>
+    <w:p>
+      <w:r/>
+    </w:p>
+    <w:p>
+      <w:pPr>
+        <w:pStyle w:val="Heading3"/>
+      </w:pPr>
+      <w:r>
+        <w:t>Langkah demo (antarmuka http://localhost:5173)</w:t>
+      </w:r>
+    </w:p>
+    <w:p>
+      <w:r/>
+    </w:p>
+    <w:p>
+      <w:r>
+        <w:t>1. Masuk sebagai guru/admin (`admin@sekolah.test`). Menu **Kelas · Mapel · Murid · Pengaturan** muncul (hanya guru/admin).</w:t>
+      </w:r>
+    </w:p>
+    <w:p>
+      <w:r>
+        <w:t>2. **Kelas**: tambah "4A" tingkat 4 → muncul di tabel; ubah/hapus berfungsi.</w:t>
+      </w:r>
+    </w:p>
+    <w:p>
+      <w:r>
+        <w:t>3. **Mapel**: tambah "Seni Budaya" kode SBD.</w:t>
+      </w:r>
+    </w:p>
+    <w:p>
+      <w:r>
+        <w:t>4. **Murid → Impor CSV**: unggah `backend/database/data/contoh-murid.csv` → laporan "4 baris berhasil diimpor, 0 baris gagal". Coba berkas dengan email salah / kelas tidak ada → muncul laporan galat per baris (maks 100 baris).</w:t>
+      </w:r>
+    </w:p>
+    <w:p>
+      <w:r>
+        <w:t>5. **Murid → Ekspor CSV**: tautan Ekspor mengunduh CSV (kolom `nis,nisn,nama,email,kelas`).</w:t>
+      </w:r>
+    </w:p>
+    <w:p>
+      <w:r>
+        <w:t>6. **Pengaturan**: nonaktifkan "Izinkan ulangan ulang (retry)" di lapis **Sekolah**; pilih lapis **Kelas** → nilai kelas menimpa sekolah; centang **"Kunci di sekolah"** → nilai sekolah menang.</w:t>
+      </w:r>
+    </w:p>
+    <w:p>
+      <w:r>
+        <w:t>7. Masuk sebagai murid hasil impor (impor dengan kolom `kata_sandi`) → murid melihat pengaturan yang berlaku, tetapi tidak bisa mengubahnya.</w:t>
+      </w:r>
+    </w:p>
+    <w:p>
+      <w:r/>
+    </w:p>
+    <w:p>
+      <w:pPr>
+        <w:pStyle w:val="Heading3"/>
+      </w:pPr>
+      <w:r>
+        <w:t>Bukti lewat API (curl)</w:t>
+      </w:r>
+    </w:p>
+    <w:p>
+      <w:r/>
+    </w:p>
+    <w:p>
+      <w:r>
+        <w:t>Lihat `docs/laporan-pengujian.md` bagian A.4.3 — smoke nyata: csrf → login admin → impor 4 murid → daftar → ekspor CSV → set pengaturan → login murid → murid melihat `retry=false` → murid ubah = 403.</w:t>
       </w:r>
     </w:p>
     <w:sectPr>

</xml_diff>

<commit_message>
Dokumentasi slice 04: smoke CDP, laporan pengujian, catatan demo, dan Word
Mencatat alur pengerjaan ulangan yang diuji lewat browser sungguhan (13/13
lulus), temuan bug jadwal bergeser 7 jam beserta perbaikannya, serta ekspor
ulang Word sesuai kebijakan dokumentasi.

🤖 Generated with Codebuff
Co-Authored-By: Codebuff <noreply@codebuff.com>
</commit_message>
<xml_diff>
--- a/docs/word-arsip/(ARSIP) catatan-demo.docx
+++ b/docs/word-arsip/(ARSIP) catatan-demo.docx
@@ -507,6 +507,167 @@
         <w:t>`docs/smoke-ui-slice03.mjs` (Chrome CDP, port 9333) menjalankan alur ini sendiri: guru membuat tag + satu soal lewat formulir, mengubah jadwal, menyusun 2 soal, menerbitkan kuis; lalu murid uji membuka kuisnya. Hasil terakhir **8/8 lulus** — rincian di `docs/laporan-pengujian.md` bagian A.5.</w:t>
       </w:r>
     </w:p>
+    <w:p>
+      <w:r/>
+    </w:p>
+    <w:p>
+      <w:pPr>
+        <w:pStyle w:val="Heading2"/>
+      </w:pPr>
+      <w:r>
+        <w:t>Demo Slice 04 — Mengerjakan Ulangan, Penilaian Otomatis, dan Hasil</w:t>
+      </w:r>
+    </w:p>
+    <w:p>
+      <w:r/>
+    </w:p>
+    <w:p>
+      <w:r>
+        <w:t>Prasyarat sama seperti demo slice 03 (backend 8000, frontend 5173, migrasi + seed). Tambahan: jalankan</w:t>
+      </w:r>
+    </w:p>
+    <w:p>
+      <w:r>
+        <w:t>`php artisan migrate --force` untuk dua migrasi slice 04 (`attempts`, `answers`).</w:t>
+      </w:r>
+    </w:p>
+    <w:p>
+      <w:r/>
+    </w:p>
+    <w:p>
+      <w:pPr>
+        <w:pStyle w:val="Heading3"/>
+      </w:pPr>
+      <w:r>
+        <w:t>Langkah demo (murid dan guru)</w:t>
+      </w:r>
+    </w:p>
+    <w:p>
+      <w:r/>
+    </w:p>
+    <w:p>
+      <w:r>
+        <w:t>1. **Guru menyiapkan jadwal** (masuk `admin@sekolah.test`): buka **Kuis** → ubah jadwal kuis terbit agar</w:t>
+      </w:r>
+    </w:p>
+    <w:p>
+      <w:r>
+        <w:t xml:space="preserve">   mulai beberapa menit yang lalu dan selesai satu jam ke depan → simpan. Status berubah menjadi</w:t>
+      </w:r>
+    </w:p>
+    <w:p>
+      <w:r>
+        <w:t xml:space="preserve">   **Sedang berjalan** pada jam yang benar (lihat A.6.4: kiriman jadwal kini dikonversi ke UTC).</w:t>
+      </w:r>
+    </w:p>
+    <w:p>
+      <w:r>
+        <w:t>2. **Murid mengerjakan** (masuk `smoke.murid@sekolah.test`, kelas yang sama): menu **Ulangan Saya** →</w:t>
+      </w:r>
+    </w:p>
+    <w:p>
+      <w:r>
+        <w:t xml:space="preserve">   tekan **Kerjakan sekarang**.</w:t>
+      </w:r>
+    </w:p>
+    <w:p>
+      <w:pPr>
+        <w:pStyle w:val="ListBullet"/>
+      </w:pPr>
+      <w:r>
+        <w:t>timer berjalan (contoh 20:00) dan berubah warna saat sisa ≤5 menit / ≤1 menit;</w:t>
+      </w:r>
+    </w:p>
+    <w:p>
+      <w:pPr>
+        <w:pStyle w:val="ListBullet"/>
+      </w:pPr>
+      <w:r>
+        <w:t>soal ditampilkan tanpa kunci; setiap jawaban tersimpan otomatis (indikator "Terjawab" bertambah);</w:t>
+      </w:r>
+    </w:p>
+    <w:p>
+      <w:pPr>
+        <w:pStyle w:val="ListBullet"/>
+      </w:pPr>
+      <w:r>
+        <w:t>tutup lalu buka kembali halaman: jawaban tetap ada (dipulihkan dari server + cadangan lokal).</w:t>
+      </w:r>
+    </w:p>
+    <w:p>
+      <w:r>
+        <w:t>3. **Kumpulkan**: tekan **Kumpulkan jawaban** → konfirmasi → diarahkan ke **halaman hasil**.</w:t>
+      </w:r>
+    </w:p>
+    <w:p>
+      <w:pPr>
+        <w:pStyle w:val="ListBullet"/>
+      </w:pPr>
+      <w:r>
+        <w:t>Uji idempoten: klik/ubah dua kali, atau muat ulang — hasil tidak berubah.</w:t>
+      </w:r>
+    </w:p>
+    <w:p>
+      <w:pPr>
+        <w:pStyle w:val="ListBullet"/>
+      </w:pPr>
+      <w:r>
+        <w:t>Bila waktu habis, jawaban dikumpulkan otomatis oleh klien; server tetap penentu akhir (toleransi</w:t>
+      </w:r>
+    </w:p>
+    <w:p>
+      <w:r>
+        <w:rPr>
+          <w:rFonts w:ascii="Courier New" w:hAnsi="Courier New"/>
+          <w:sz w:val="18"/>
+        </w:rPr>
+        <w:t xml:space="preserve">     keterlambatan 120 detik).</w:t>
+      </w:r>
+    </w:p>
+    <w:p>
+      <w:r>
+        <w:t>4. **Halaman hasil**: menampilkan skor, jumlah benar, nilai (persen), ringkasan penilaian</w:t>
+      </w:r>
+    </w:p>
+    <w:p>
+      <w:r>
+        <w:t xml:space="preserve">   (dinilai / perlu tinjau / gagal / belum dijawab), dan rincian per soal — **tanpa kunci jawaban maupun</w:t>
+      </w:r>
+    </w:p>
+    <w:p>
+      <w:r>
+        <w:t xml:space="preserve">   pembahasan** (server memang tidak mengirimkannya).</w:t>
+      </w:r>
+    </w:p>
+    <w:p>
+      <w:r/>
+    </w:p>
+    <w:p>
+      <w:pPr>
+        <w:pStyle w:val="Heading3"/>
+      </w:pPr>
+      <w:r>
+        <w:t>Bukti lewat browser sungguhan</w:t>
+      </w:r>
+    </w:p>
+    <w:p>
+      <w:r/>
+    </w:p>
+    <w:p>
+      <w:r>
+        <w:t>`docs/smoke-ui-slice04.mjs` (Chrome CDP, port 9333) menjalankan alur ini sendiri: guru menjadwalkan ulang</w:t>
+      </w:r>
+    </w:p>
+    <w:p>
+      <w:r>
+        <w:t>kuis, murid memilih opsi kunci, autosave diverifikasi lewat API, lalu mengumpulkan dan membuka hasil.</w:t>
+      </w:r>
+    </w:p>
+    <w:p>
+      <w:r>
+        <w:t>Hasil terakhir **13/13 lulus** — rincian di `docs/laporan-pengujian.md` bagian A.6.</w:t>
+      </w:r>
+    </w:p>
     <w:sectPr>
       <w:pgSz w:w="12240" w:h="15840"/>
       <w:pgMar w:top="1440" w:right="1800" w:bottom="1440" w:left="1800" w:header="720" w:footer="720" w:gutter="0"/>

</xml_diff>